<commit_message>
docs: sync teacher deployment package with 8c2d7d6 and fix Korean PDF fonts
Re-verified 00-05 against current UI code (SetupPage step labels,
BLOCK_POSITION reference-block flow, +/- number clamp, teacher
problem-preview Korean labels from 8c2d7d6); added a short "교사 문제
미리보기" section to 04. Renamed the install/connection info folder to
설치및접속정보 per naming convention. Fixed DOCX->PDF Korean glyph
rendering (headless LibreOffice needed an isolated FONTCONFIG_FILE to
resolve Arial Unicode/Apple SD Gothic Neo) and rebuilt the ZIP with an
explicit UTF-8 filename flag for cross-platform extraction. No app,
problem, grading, API, or DB changes.
</commit_message>
<xml_diff>
--- a/docs/2026-09-20_수학공간과입체_배포문서/문서원본/00_먼저읽어주세요.docx
+++ b/docs/2026-09-20_수학공간과입체_배포문서/문서원본/00_먼저읽어주세요.docx
@@ -490,7 +490,7 @@
       <w:spacing w:after="120" w:line="276" w:lineRule="auto"/>
     </w:pPr>
     <w:rPr>
-      <w:rFonts w:ascii="Arial Unicode MS" w:hAnsi="Arial Unicode MS" w:eastAsia="Arial Unicode MS"/>
+      <w:rFonts w:ascii="Apple SD Gothic Neo" w:hAnsi="Apple SD Gothic Neo" w:eastAsia="Apple SD Gothic Neo"/>
       <w:color w:val="000000"/>
       <w:sz w:val="21"/>
     </w:rPr>
@@ -554,7 +554,7 @@
       <w:outlineLvl w:val="0"/>
     </w:pPr>
     <w:rPr>
-      <w:rFonts w:asciiTheme="majorHAnsi" w:eastAsiaTheme="majorEastAsia" w:hAnsiTheme="majorHAnsi" w:cstheme="majorBidi" w:ascii="Arial Unicode MS" w:hAnsi="Arial Unicode MS" w:eastAsia="Arial Unicode MS"/>
+      <w:rFonts w:asciiTheme="majorHAnsi" w:eastAsiaTheme="majorEastAsia" w:hAnsiTheme="majorHAnsi" w:cstheme="majorBidi" w:ascii="Apple SD Gothic Neo" w:hAnsi="Apple SD Gothic Neo" w:eastAsia="Apple SD Gothic Neo"/>
       <w:b/>
       <w:bCs/>
       <w:color w:val="000000"/>
@@ -578,7 +578,7 @@
       <w:outlineLvl w:val="1"/>
     </w:pPr>
     <w:rPr>
-      <w:rFonts w:asciiTheme="majorHAnsi" w:eastAsiaTheme="majorEastAsia" w:hAnsiTheme="majorHAnsi" w:cstheme="majorBidi" w:ascii="Arial Unicode MS" w:hAnsi="Arial Unicode MS" w:eastAsia="Arial Unicode MS"/>
+      <w:rFonts w:asciiTheme="majorHAnsi" w:eastAsiaTheme="majorEastAsia" w:hAnsiTheme="majorHAnsi" w:cstheme="majorBidi" w:ascii="Apple SD Gothic Neo" w:hAnsi="Apple SD Gothic Neo" w:eastAsia="Apple SD Gothic Neo"/>
       <w:b/>
       <w:bCs/>
       <w:color w:val="000000"/>
@@ -843,7 +843,7 @@
       <w:contextualSpacing/>
     </w:pPr>
     <w:rPr>
-      <w:rFonts w:asciiTheme="majorHAnsi" w:eastAsiaTheme="majorEastAsia" w:hAnsiTheme="majorHAnsi" w:cstheme="majorBidi" w:ascii="Arial Unicode MS" w:hAnsi="Arial Unicode MS" w:eastAsia="Arial Unicode MS"/>
+      <w:rFonts w:asciiTheme="majorHAnsi" w:eastAsiaTheme="majorEastAsia" w:hAnsiTheme="majorHAnsi" w:cstheme="majorBidi" w:ascii="Apple SD Gothic Neo" w:hAnsi="Apple SD Gothic Neo" w:eastAsia="Apple SD Gothic Neo"/>
       <w:color w:val="000000"/>
       <w:spacing w:val="5"/>
       <w:kern w:val="28"/>
@@ -1285,7 +1285,7 @@
       <w:spacing w:line="240" w:lineRule="auto"/>
     </w:pPr>
     <w:rPr>
-      <w:rFonts w:ascii="Arial Unicode MS" w:hAnsi="Arial Unicode MS" w:eastAsia="Arial Unicode MS"/>
+      <w:rFonts w:ascii="Apple SD Gothic Neo" w:hAnsi="Apple SD Gothic Neo" w:eastAsia="Apple SD Gothic Neo"/>
       <w:b/>
       <w:bCs/>
       <w:color w:val="000000"/>

</xml_diff>